<commit_message>
refactor: optimize embedded skill and clean repository
</commit_message>
<xml_diff>
--- a/WPT无线充电系统-从零搭建完整操作手册.docx
+++ b/WPT无线充电系统-从零搭建完整操作手册.docx
@@ -3283,6 +3283,20 @@
           <w:szCs w:val="22"/>
         </w:rPr>
         <w:t xml:space="preserve">项目不再使用 `Claude_Files/` 和 `docs/superpowers/`。旧资料已完整迁移到 `NONFILE/`，生产代码不得引用该目录。</w:t>
+      </w:r>
+    </w:p>
+    <w:p>
+      <w:pPr>
+        <w:spacing w:line="360"/>
+      </w:pPr>
+      <w:r>
+        <w:rPr>
+          <w:rFonts w:ascii="SimSun" w:cs="SimSun" w:eastAsia="SimSun" w:hAnsi="SimSun"/>
+          <w:color w:val="333333"/>
+          <w:sz w:val="22"/>
+          <w:szCs w:val="22"/>
+        </w:rPr>
+        <w:t xml:space="preserve">除 `NONFILE/README.md` 外，归档文件名必须以内容对应的 `-Vx.y.z` 结尾，版本尾缀放在扩展名前。</w:t>
       </w:r>
     </w:p>
     <w:p/>
@@ -10841,7 +10855,7 @@
                 <w:sz w:val="20"/>
                 <w:szCs w:val="20"/>
               </w:rPr>
-              <w:t xml:space="preserve">4</w:t>
+              <w:t xml:space="preserve">5</w:t>
             </w:r>
           </w:p>
         </w:tc>
@@ -10872,7 +10886,7 @@
                 <w:sz w:val="20"/>
                 <w:szCs w:val="20"/>
               </w:rPr>
-              <w:t xml:space="preserve">F+/F-/ON/PAGE</w:t>
+              <w:t xml:space="preserve">KEY0–KEY4</w:t>
             </w:r>
           </w:p>
         </w:tc>
@@ -10967,7 +10981,7 @@
                 <w:sz w:val="20"/>
                 <w:szCs w:val="20"/>
               </w:rPr>
-              <w:t xml:space="preserve">3mm ×6</w:t>
+              <w:t xml:space="preserve">3mm</w:t>
             </w:r>
           </w:p>
         </w:tc>
@@ -10998,7 +11012,7 @@
                 <w:sz w:val="20"/>
                 <w:szCs w:val="20"/>
               </w:rPr>
-              <w:t xml:space="preserve">6</w:t>
+              <w:t xml:space="preserve">4</w:t>
             </w:r>
           </w:p>
         </w:tc>
@@ -11029,7 +11043,7 @@
                 <w:sz w:val="20"/>
                 <w:szCs w:val="20"/>
               </w:rPr>
-              <w:t xml:space="preserve">状态指示</w:t>
+              <w:t xml:space="preserve">WiFi/电源/运行/心跳状态</w:t>
             </w:r>
           </w:p>
         </w:tc>
@@ -15693,23 +15707,6 @@
           <w:sz w:val="19"/>
           <w:szCs w:val="19"/>
         </w:rPr>
-        <w:t xml:space="preserve">│   ├── App_Network.c/h     ← WiFi+心跳+帧快照+遥测门控 (以前在Hardware, 现移至User)
-</w:t>
-      </w:r>
-    </w:p>
-    <w:p>
-      <w:pPr>
-        <w:shd w:fill="F5F5F5" w:val="clear"/>
-        <w:spacing w:line="240"/>
-        <w:ind w:left="360"/>
-      </w:pPr>
-      <w:r>
-        <w:rPr>
-          <w:rFonts w:ascii="Consolas" w:cs="Consolas" w:eastAsia="Consolas" w:hAnsi="Consolas"/>
-          <w:color w:val="2D2D2D"/>
-          <w:sz w:val="19"/>
-          <w:szCs w:val="19"/>
-        </w:rPr>
         <w:t xml:space="preserve">│   ├── Adc_Driver.c/h      ← TIM3 500Hz触发 + 模拟看门狗 + 64点显示/8点安全窗口</w:t>
       </w:r>
     </w:p>
@@ -16155,8 +16152,7 @@
           <w:sz w:val="19"/>
           <w:szCs w:val="19"/>
         </w:rPr>
-        <w:t xml:space="preserve">        last = Sys_Timer_GetTick();
-</w:t>
+        <w:t xml:space="preserve">        last = Sys_Timer_Get_Tick();</w:t>
       </w:r>
     </w:p>
     <w:p>

</xml_diff>